<commit_message>
Improve phase diagrams and regenerate submission docx
Co-authored-by: romanstocksdumbmoney <romanstocksdumbmoney@users.noreply.github.com>
</commit_message>
<xml_diff>
--- a/Completed_Mitosis_and_Meiosis_Worksheet.docx
+++ b/Completed_Mitosis_and_Meiosis_Worksheet.docx
@@ -125,34 +125,52 @@
           <w:sz w:val="22"/>
           <w:szCs w:val="22"/>
         </w:rPr>
-        <w:t xml:space="preserve">Legend for simple drawings:</w:t>
-      </w:r>
-    </w:p>
-    <w:p>
-      <w:r>
-        <w:rPr>
-          <w:sz w:val="22"/>
-          <w:szCs w:val="22"/>
-        </w:rPr>
-        <w:t xml:space="preserve">- `X` shape = replicated chromosome (2 sister chromatids)</w:t>
-      </w:r>
-    </w:p>
-    <w:p>
-      <w:r>
-        <w:rPr>
-          <w:sz w:val="22"/>
-          <w:szCs w:val="22"/>
-        </w:rPr>
-        <w:t xml:space="preserve">- `|` = single chromatid (after separation)</w:t>
-      </w:r>
-    </w:p>
-    <w:p>
-      <w:r>
-        <w:rPr>
-          <w:sz w:val="22"/>
-          <w:szCs w:val="22"/>
-        </w:rPr>
-        <w:t xml:space="preserve">- `[SF]` = spindle fibers</w:t>
+        <w:t xml:space="preserve">Legend for drawings:</w:t>
+      </w:r>
+    </w:p>
+    <w:p>
+      <w:r>
+        <w:rPr>
+          <w:sz w:val="22"/>
+          <w:szCs w:val="22"/>
+        </w:rPr>
+        <w:t xml:space="preserve">- `*` = centrosome (contains centrioles)</w:t>
+      </w:r>
+    </w:p>
+    <w:p>
+      <w:r>
+        <w:rPr>
+          <w:sz w:val="22"/>
+          <w:szCs w:val="22"/>
+        </w:rPr>
+        <w:t xml:space="preserve">- `---` = spindle fibers</w:t>
+      </w:r>
+    </w:p>
+    <w:p>
+      <w:r>
+        <w:rPr>
+          <w:sz w:val="22"/>
+          <w:szCs w:val="22"/>
+        </w:rPr>
+        <w:t xml:space="preserve">- `( )` = nuclear membrane</w:t>
+      </w:r>
+    </w:p>
+    <w:p>
+      <w:r>
+        <w:rPr>
+          <w:sz w:val="22"/>
+          <w:szCs w:val="22"/>
+        </w:rPr>
+        <w:t xml:space="preserve">- `X` = replicated chromosome (sister chromatids)</w:t>
+      </w:r>
+    </w:p>
+    <w:p>
+      <w:r>
+        <w:rPr>
+          <w:sz w:val="22"/>
+          <w:szCs w:val="22"/>
+        </w:rPr>
+        <w:t xml:space="preserve">- `|` = single chromosome after chromatid separation</w:t>
       </w:r>
     </w:p>
     <w:p>
@@ -183,57 +201,117 @@
           <w:sz w:val="20"/>
           <w:szCs w:val="20"/>
         </w:rPr>
-        <w:t xml:space="preserve">   __________________________</w:t>
-      </w:r>
-    </w:p>
-    <w:p>
-      <w:r>
-        <w:rPr>
-          <w:rFonts w:ascii="Courier New" w:cs="Courier New" w:eastAsia="Courier New" w:hAnsi="Courier New"/>
-          <w:sz w:val="20"/>
-          <w:szCs w:val="20"/>
-        </w:rPr>
-        <w:t xml:space="preserve">  /                          \</w:t>
-      </w:r>
-    </w:p>
-    <w:p>
-      <w:r>
-        <w:rPr>
-          <w:rFonts w:ascii="Courier New" w:cs="Courier New" w:eastAsia="Courier New" w:hAnsi="Courier New"/>
-          <w:sz w:val="20"/>
-          <w:szCs w:val="20"/>
-        </w:rPr>
-        <w:t xml:space="preserve"> |   X(A)    X(a)   X(B) X(b) |</w:t>
-      </w:r>
-    </w:p>
-    <w:p>
-      <w:r>
-        <w:rPr>
-          <w:rFonts w:ascii="Courier New" w:cs="Courier New" w:eastAsia="Courier New" w:hAnsi="Courier New"/>
-          <w:sz w:val="20"/>
-          <w:szCs w:val="20"/>
-        </w:rPr>
-        <w:t xml:space="preserve"> |        (nuclear membrane   |</w:t>
-      </w:r>
-    </w:p>
-    <w:p>
-      <w:r>
-        <w:rPr>
-          <w:rFonts w:ascii="Courier New" w:cs="Courier New" w:eastAsia="Courier New" w:hAnsi="Courier New"/>
-          <w:sz w:val="20"/>
-          <w:szCs w:val="20"/>
-        </w:rPr>
-        <w:t xml:space="preserve"> |         breaking down)     |</w:t>
-      </w:r>
-    </w:p>
-    <w:p>
-      <w:r>
-        <w:rPr>
-          <w:rFonts w:ascii="Courier New" w:cs="Courier New" w:eastAsia="Courier New" w:hAnsi="Courier New"/>
-          <w:sz w:val="20"/>
-          <w:szCs w:val="20"/>
-        </w:rPr>
-        <w:t xml:space="preserve">  \__________________________/</w:t>
+        <w:t xml:space="preserve">           _________________________________</w:t>
+      </w:r>
+    </w:p>
+    <w:p>
+      <w:r>
+        <w:rPr>
+          <w:rFonts w:ascii="Courier New" w:cs="Courier New" w:eastAsia="Courier New" w:hAnsi="Courier New"/>
+          <w:sz w:val="20"/>
+          <w:szCs w:val="20"/>
+        </w:rPr>
+        <w:t xml:space="preserve">         /                                   \</w:t>
+      </w:r>
+    </w:p>
+    <w:p>
+      <w:r>
+        <w:rPr>
+          <w:rFonts w:ascii="Courier New" w:cs="Courier New" w:eastAsia="Courier New" w:hAnsi="Courier New"/>
+          <w:sz w:val="20"/>
+          <w:szCs w:val="20"/>
+        </w:rPr>
+        <w:t xml:space="preserve">        /                                     \</w:t>
+      </w:r>
+    </w:p>
+    <w:p>
+      <w:r>
+        <w:rPr>
+          <w:rFonts w:ascii="Courier New" w:cs="Courier New" w:eastAsia="Courier New" w:hAnsi="Courier New"/>
+          <w:sz w:val="20"/>
+          <w:szCs w:val="20"/>
+        </w:rPr>
+        <w:t xml:space="preserve">       |     *                         *       |</w:t>
+      </w:r>
+    </w:p>
+    <w:p>
+      <w:r>
+        <w:rPr>
+          <w:rFonts w:ascii="Courier New" w:cs="Courier New" w:eastAsia="Courier New" w:hAnsi="Courier New"/>
+          <w:sz w:val="20"/>
+          <w:szCs w:val="20"/>
+        </w:rPr>
+        <w:t xml:space="preserve">       |      \                       /        |</w:t>
+      </w:r>
+    </w:p>
+    <w:p>
+      <w:r>
+        <w:rPr>
+          <w:rFonts w:ascii="Courier New" w:cs="Courier New" w:eastAsia="Courier New" w:hAnsi="Courier New"/>
+          <w:sz w:val="20"/>
+          <w:szCs w:val="20"/>
+        </w:rPr>
+        <w:t xml:space="preserve">       |       \                     /         |</w:t>
+      </w:r>
+    </w:p>
+    <w:p>
+      <w:r>
+        <w:rPr>
+          <w:rFonts w:ascii="Courier New" w:cs="Courier New" w:eastAsia="Courier New" w:hAnsi="Courier New"/>
+          <w:sz w:val="20"/>
+          <w:szCs w:val="20"/>
+        </w:rPr>
+        <w:t xml:space="preserve">       |          (   X(A)   X(a)   )         |</w:t>
+      </w:r>
+    </w:p>
+    <w:p>
+      <w:r>
+        <w:rPr>
+          <w:rFonts w:ascii="Courier New" w:cs="Courier New" w:eastAsia="Courier New" w:hAnsi="Courier New"/>
+          <w:sz w:val="20"/>
+          <w:szCs w:val="20"/>
+        </w:rPr>
+        <w:t xml:space="preserve">       |          (   X(B)   X(b)   )         |</w:t>
+      </w:r>
+    </w:p>
+    <w:p>
+      <w:r>
+        <w:rPr>
+          <w:rFonts w:ascii="Courier New" w:cs="Courier New" w:eastAsia="Courier New" w:hAnsi="Courier New"/>
+          <w:sz w:val="20"/>
+          <w:szCs w:val="20"/>
+        </w:rPr>
+        <w:t xml:space="preserve">       |            nuclear membrane           |</w:t>
+      </w:r>
+    </w:p>
+    <w:p>
+      <w:r>
+        <w:rPr>
+          <w:rFonts w:ascii="Courier New" w:cs="Courier New" w:eastAsia="Courier New" w:hAnsi="Courier New"/>
+          <w:sz w:val="20"/>
+          <w:szCs w:val="20"/>
+        </w:rPr>
+        <w:t xml:space="preserve">       |            breaking down              |</w:t>
+      </w:r>
+    </w:p>
+    <w:p>
+      <w:r>
+        <w:rPr>
+          <w:rFonts w:ascii="Courier New" w:cs="Courier New" w:eastAsia="Courier New" w:hAnsi="Courier New"/>
+          <w:sz w:val="20"/>
+          <w:szCs w:val="20"/>
+        </w:rPr>
+        <w:t xml:space="preserve">        \                                     /</w:t>
+      </w:r>
+    </w:p>
+    <w:p>
+      <w:r>
+        <w:rPr>
+          <w:rFonts w:ascii="Courier New" w:cs="Courier New" w:eastAsia="Courier New" w:hAnsi="Courier New"/>
+          <w:sz w:val="20"/>
+          <w:szCs w:val="20"/>
+        </w:rPr>
+        <w:t xml:space="preserve">         \___________________________________/</w:t>
       </w:r>
     </w:p>
     <w:p>
@@ -254,82 +332,112 @@
           <w:sz w:val="24"/>
           <w:szCs w:val="24"/>
         </w:rPr>
-        <w:t xml:space="preserve">Metaphase (chromosomes line up single file at center)</w:t>
-      </w:r>
-    </w:p>
-    <w:p>
-      <w:r>
-        <w:t xml:space="preserve"/>
-      </w:r>
-    </w:p>
-    <w:p>
-      <w:r>
-        <w:rPr>
-          <w:rFonts w:ascii="Courier New" w:cs="Courier New" w:eastAsia="Courier New" w:hAnsi="Courier New"/>
-          <w:sz w:val="20"/>
-          <w:szCs w:val="20"/>
-        </w:rPr>
-        <w:t xml:space="preserve">   __________________________</w:t>
-      </w:r>
-    </w:p>
-    <w:p>
-      <w:r>
-        <w:rPr>
-          <w:rFonts w:ascii="Courier New" w:cs="Courier New" w:eastAsia="Courier New" w:hAnsi="Courier New"/>
-          <w:sz w:val="20"/>
-          <w:szCs w:val="20"/>
-        </w:rPr>
-        <w:t xml:space="preserve">  /                          \</w:t>
-      </w:r>
-    </w:p>
-    <w:p>
-      <w:r>
-        <w:rPr>
-          <w:rFonts w:ascii="Courier New" w:cs="Courier New" w:eastAsia="Courier New" w:hAnsi="Courier New"/>
-          <w:sz w:val="20"/>
-          <w:szCs w:val="20"/>
-        </w:rPr>
-        <w:t xml:space="preserve"> | [SF]--&gt; X(A)              |</w:t>
-      </w:r>
-    </w:p>
-    <w:p>
-      <w:r>
-        <w:rPr>
-          <w:rFonts w:ascii="Courier New" w:cs="Courier New" w:eastAsia="Courier New" w:hAnsi="Courier New"/>
-          <w:sz w:val="20"/>
-          <w:szCs w:val="20"/>
-        </w:rPr>
-        <w:t xml:space="preserve"> | [SF]--&gt; X(a)   |equator|  |</w:t>
-      </w:r>
-    </w:p>
-    <w:p>
-      <w:r>
-        <w:rPr>
-          <w:rFonts w:ascii="Courier New" w:cs="Courier New" w:eastAsia="Courier New" w:hAnsi="Courier New"/>
-          <w:sz w:val="20"/>
-          <w:szCs w:val="20"/>
-        </w:rPr>
-        <w:t xml:space="preserve"> | [SF]--&gt; X(B)              |</w:t>
-      </w:r>
-    </w:p>
-    <w:p>
-      <w:r>
-        <w:rPr>
-          <w:rFonts w:ascii="Courier New" w:cs="Courier New" w:eastAsia="Courier New" w:hAnsi="Courier New"/>
-          <w:sz w:val="20"/>
-          <w:szCs w:val="20"/>
-        </w:rPr>
-        <w:t xml:space="preserve"> | [SF]--&gt; X(b)              |</w:t>
-      </w:r>
-    </w:p>
-    <w:p>
-      <w:r>
-        <w:rPr>
-          <w:rFonts w:ascii="Courier New" w:cs="Courier New" w:eastAsia="Courier New" w:hAnsi="Courier New"/>
-          <w:sz w:val="20"/>
-          <w:szCs w:val="20"/>
-        </w:rPr>
-        <w:t xml:space="preserve">  \__________________________/</w:t>
+        <w:t xml:space="preserve">Metaphase (chromosomes line up at equator)</w:t>
+      </w:r>
+    </w:p>
+    <w:p>
+      <w:r>
+        <w:t xml:space="preserve"/>
+      </w:r>
+    </w:p>
+    <w:p>
+      <w:r>
+        <w:rPr>
+          <w:rFonts w:ascii="Courier New" w:cs="Courier New" w:eastAsia="Courier New" w:hAnsi="Courier New"/>
+          <w:sz w:val="20"/>
+          <w:szCs w:val="20"/>
+        </w:rPr>
+        <w:t xml:space="preserve">           _________________________________</w:t>
+      </w:r>
+    </w:p>
+    <w:p>
+      <w:r>
+        <w:rPr>
+          <w:rFonts w:ascii="Courier New" w:cs="Courier New" w:eastAsia="Courier New" w:hAnsi="Courier New"/>
+          <w:sz w:val="20"/>
+          <w:szCs w:val="20"/>
+        </w:rPr>
+        <w:t xml:space="preserve">         /                                   \</w:t>
+      </w:r>
+    </w:p>
+    <w:p>
+      <w:r>
+        <w:rPr>
+          <w:rFonts w:ascii="Courier New" w:cs="Courier New" w:eastAsia="Courier New" w:hAnsi="Courier New"/>
+          <w:sz w:val="20"/>
+          <w:szCs w:val="20"/>
+        </w:rPr>
+        <w:t xml:space="preserve">        /                                     \</w:t>
+      </w:r>
+    </w:p>
+    <w:p>
+      <w:r>
+        <w:rPr>
+          <w:rFonts w:ascii="Courier New" w:cs="Courier New" w:eastAsia="Courier New" w:hAnsi="Courier New"/>
+          <w:sz w:val="20"/>
+          <w:szCs w:val="20"/>
+        </w:rPr>
+        <w:t xml:space="preserve">       |   *-----------------------------*     |</w:t>
+      </w:r>
+    </w:p>
+    <w:p>
+      <w:r>
+        <w:rPr>
+          <w:rFonts w:ascii="Courier New" w:cs="Courier New" w:eastAsia="Courier New" w:hAnsi="Courier New"/>
+          <w:sz w:val="20"/>
+          <w:szCs w:val="20"/>
+        </w:rPr>
+        <w:t xml:space="preserve">       |        X(A)   X(a)   X(B)   X(b)     |</w:t>
+      </w:r>
+    </w:p>
+    <w:p>
+      <w:r>
+        <w:rPr>
+          <w:rFonts w:ascii="Courier New" w:cs="Courier New" w:eastAsia="Courier New" w:hAnsi="Courier New"/>
+          <w:sz w:val="20"/>
+          <w:szCs w:val="20"/>
+        </w:rPr>
+        <w:t xml:space="preserve">       |              |  equator  |           |</w:t>
+      </w:r>
+    </w:p>
+    <w:p>
+      <w:r>
+        <w:rPr>
+          <w:rFonts w:ascii="Courier New" w:cs="Courier New" w:eastAsia="Courier New" w:hAnsi="Courier New"/>
+          <w:sz w:val="20"/>
+          <w:szCs w:val="20"/>
+        </w:rPr>
+        <w:t xml:space="preserve">       |   spindle fibers attached to          |</w:t>
+      </w:r>
+    </w:p>
+    <w:p>
+      <w:r>
+        <w:rPr>
+          <w:rFonts w:ascii="Courier New" w:cs="Courier New" w:eastAsia="Courier New" w:hAnsi="Courier New"/>
+          <w:sz w:val="20"/>
+          <w:szCs w:val="20"/>
+        </w:rPr>
+        <w:t xml:space="preserve">       |   centromeres from opposite poles     |</w:t>
+      </w:r>
+    </w:p>
+    <w:p>
+      <w:r>
+        <w:rPr>
+          <w:rFonts w:ascii="Courier New" w:cs="Courier New" w:eastAsia="Courier New" w:hAnsi="Courier New"/>
+          <w:sz w:val="20"/>
+          <w:szCs w:val="20"/>
+        </w:rPr>
+        <w:t xml:space="preserve">        \                                     /</w:t>
+      </w:r>
+    </w:p>
+    <w:p>
+      <w:r>
+        <w:rPr>
+          <w:rFonts w:ascii="Courier New" w:cs="Courier New" w:eastAsia="Courier New" w:hAnsi="Courier New"/>
+          <w:sz w:val="20"/>
+          <w:szCs w:val="20"/>
+        </w:rPr>
+        <w:t xml:space="preserve">         \___________________________________/</w:t>
       </w:r>
     </w:p>
     <w:p>
@@ -365,57 +473,97 @@
           <w:sz w:val="20"/>
           <w:szCs w:val="20"/>
         </w:rPr>
-        <w:t xml:space="preserve">   __________________________</w:t>
-      </w:r>
-    </w:p>
-    <w:p>
-      <w:r>
-        <w:rPr>
-          <w:rFonts w:ascii="Courier New" w:cs="Courier New" w:eastAsia="Courier New" w:hAnsi="Courier New"/>
-          <w:sz w:val="20"/>
-          <w:szCs w:val="20"/>
-        </w:rPr>
-        <w:t xml:space="preserve">  /                          \</w:t>
-      </w:r>
-    </w:p>
-    <w:p>
-      <w:r>
-        <w:rPr>
-          <w:rFonts w:ascii="Courier New" w:cs="Courier New" w:eastAsia="Courier New" w:hAnsi="Courier New"/>
-          <w:sz w:val="20"/>
-          <w:szCs w:val="20"/>
-        </w:rPr>
-        <w:t xml:space="preserve"> |  A|  a|   B|  b|   -&gt;     |</w:t>
-      </w:r>
-    </w:p>
-    <w:p>
-      <w:r>
-        <w:rPr>
-          <w:rFonts w:ascii="Courier New" w:cs="Courier New" w:eastAsia="Courier New" w:hAnsi="Courier New"/>
-          <w:sz w:val="20"/>
-          <w:szCs w:val="20"/>
-        </w:rPr>
-        <w:t xml:space="preserve"> |     &lt;-   |A  |a  |B  |b   |</w:t>
-      </w:r>
-    </w:p>
-    <w:p>
-      <w:r>
-        <w:rPr>
-          <w:rFonts w:ascii="Courier New" w:cs="Courier New" w:eastAsia="Courier New" w:hAnsi="Courier New"/>
-          <w:sz w:val="20"/>
-          <w:szCs w:val="20"/>
-        </w:rPr>
-        <w:t xml:space="preserve"> | (chromatids pulled apart) |</w:t>
-      </w:r>
-    </w:p>
-    <w:p>
-      <w:r>
-        <w:rPr>
-          <w:rFonts w:ascii="Courier New" w:cs="Courier New" w:eastAsia="Courier New" w:hAnsi="Courier New"/>
-          <w:sz w:val="20"/>
-          <w:szCs w:val="20"/>
-        </w:rPr>
-        <w:t xml:space="preserve">  \__________________________/</w:t>
+        <w:t xml:space="preserve">           _________________________________</w:t>
+      </w:r>
+    </w:p>
+    <w:p>
+      <w:r>
+        <w:rPr>
+          <w:rFonts w:ascii="Courier New" w:cs="Courier New" w:eastAsia="Courier New" w:hAnsi="Courier New"/>
+          <w:sz w:val="20"/>
+          <w:szCs w:val="20"/>
+        </w:rPr>
+        <w:t xml:space="preserve">         /                                   \</w:t>
+      </w:r>
+    </w:p>
+    <w:p>
+      <w:r>
+        <w:rPr>
+          <w:rFonts w:ascii="Courier New" w:cs="Courier New" w:eastAsia="Courier New" w:hAnsi="Courier New"/>
+          <w:sz w:val="20"/>
+          <w:szCs w:val="20"/>
+        </w:rPr>
+        <w:t xml:space="preserve">        /                                     \</w:t>
+      </w:r>
+    </w:p>
+    <w:p>
+      <w:r>
+        <w:rPr>
+          <w:rFonts w:ascii="Courier New" w:cs="Courier New" w:eastAsia="Courier New" w:hAnsi="Courier New"/>
+          <w:sz w:val="20"/>
+          <w:szCs w:val="20"/>
+        </w:rPr>
+        <w:t xml:space="preserve">       |     *                         *       |</w:t>
+      </w:r>
+    </w:p>
+    <w:p>
+      <w:r>
+        <w:rPr>
+          <w:rFonts w:ascii="Courier New" w:cs="Courier New" w:eastAsia="Courier New" w:hAnsi="Courier New"/>
+          <w:sz w:val="20"/>
+          <w:szCs w:val="20"/>
+        </w:rPr>
+        <w:t xml:space="preserve">       |    /|\                       /|\      |</w:t>
+      </w:r>
+    </w:p>
+    <w:p>
+      <w:r>
+        <w:rPr>
+          <w:rFonts w:ascii="Courier New" w:cs="Courier New" w:eastAsia="Courier New" w:hAnsi="Courier New"/>
+          <w:sz w:val="20"/>
+          <w:szCs w:val="20"/>
+        </w:rPr>
+        <w:t xml:space="preserve">       |   A |  B |             | a  | b      |</w:t>
+      </w:r>
+    </w:p>
+    <w:p>
+      <w:r>
+        <w:rPr>
+          <w:rFonts w:ascii="Courier New" w:cs="Courier New" w:eastAsia="Courier New" w:hAnsi="Courier New"/>
+          <w:sz w:val="20"/>
+          <w:szCs w:val="20"/>
+        </w:rPr>
+        <w:t xml:space="preserve">       |   A |  B |             | a  | b      |</w:t>
+      </w:r>
+    </w:p>
+    <w:p>
+      <w:r>
+        <w:rPr>
+          <w:rFonts w:ascii="Courier New" w:cs="Courier New" w:eastAsia="Courier New" w:hAnsi="Courier New"/>
+          <w:sz w:val="20"/>
+          <w:szCs w:val="20"/>
+        </w:rPr>
+        <w:t xml:space="preserve">       |   chromatids pulled to opposite poles |</w:t>
+      </w:r>
+    </w:p>
+    <w:p>
+      <w:r>
+        <w:rPr>
+          <w:rFonts w:ascii="Courier New" w:cs="Courier New" w:eastAsia="Courier New" w:hAnsi="Courier New"/>
+          <w:sz w:val="20"/>
+          <w:szCs w:val="20"/>
+        </w:rPr>
+        <w:t xml:space="preserve">        \                                     /</w:t>
+      </w:r>
+    </w:p>
+    <w:p>
+      <w:r>
+        <w:rPr>
+          <w:rFonts w:ascii="Courier New" w:cs="Courier New" w:eastAsia="Courier New" w:hAnsi="Courier New"/>
+          <w:sz w:val="20"/>
+          <w:szCs w:val="20"/>
+        </w:rPr>
+        <w:t xml:space="preserve">         \___________________________________/</w:t>
       </w:r>
     </w:p>
     <w:p>
@@ -451,47 +599,77 @@
           <w:sz w:val="20"/>
           <w:szCs w:val="20"/>
         </w:rPr>
-        <w:t xml:space="preserve">  _____________      _____________</w:t>
-      </w:r>
-    </w:p>
-    <w:p>
-      <w:r>
-        <w:rPr>
-          <w:rFonts w:ascii="Courier New" w:cs="Courier New" w:eastAsia="Courier New" w:hAnsi="Courier New"/>
-          <w:sz w:val="20"/>
-          <w:szCs w:val="20"/>
-        </w:rPr>
-        <w:t xml:space="preserve"> /             \    /             \</w:t>
-      </w:r>
-    </w:p>
-    <w:p>
-      <w:r>
-        <w:rPr>
-          <w:rFonts w:ascii="Courier New" w:cs="Courier New" w:eastAsia="Courier New" w:hAnsi="Courier New"/>
-          <w:sz w:val="20"/>
-          <w:szCs w:val="20"/>
-        </w:rPr>
-        <w:t xml:space="preserve">|   A  a  B  b  |  |   A  a  B  b  |</w:t>
-      </w:r>
-    </w:p>
-    <w:p>
-      <w:r>
-        <w:rPr>
-          <w:rFonts w:ascii="Courier New" w:cs="Courier New" w:eastAsia="Courier New" w:hAnsi="Courier New"/>
-          <w:sz w:val="20"/>
-          <w:szCs w:val="20"/>
-        </w:rPr>
-        <w:t xml:space="preserve">| (new nucleus) |  | (new nucleus) |</w:t>
-      </w:r>
-    </w:p>
-    <w:p>
-      <w:r>
-        <w:rPr>
-          <w:rFonts w:ascii="Courier New" w:cs="Courier New" w:eastAsia="Courier New" w:hAnsi="Courier New"/>
-          <w:sz w:val="20"/>
-          <w:szCs w:val="20"/>
-        </w:rPr>
-        <w:t xml:space="preserve"> \_____________/    \_____________/</w:t>
+        <w:t xml:space="preserve">             _______________      _______________</w:t>
+      </w:r>
+    </w:p>
+    <w:p>
+      <w:r>
+        <w:rPr>
+          <w:rFonts w:ascii="Courier New" w:cs="Courier New" w:eastAsia="Courier New" w:hAnsi="Courier New"/>
+          <w:sz w:val="20"/>
+          <w:szCs w:val="20"/>
+        </w:rPr>
+        <w:t xml:space="preserve">            /               \    /               \</w:t>
+      </w:r>
+    </w:p>
+    <w:p>
+      <w:r>
+        <w:rPr>
+          <w:rFonts w:ascii="Courier New" w:cs="Courier New" w:eastAsia="Courier New" w:hAnsi="Courier New"/>
+          <w:sz w:val="20"/>
+          <w:szCs w:val="20"/>
+        </w:rPr>
+        <w:t xml:space="preserve">           |   ( A  a  B b ) |  | ( A  a  B  b ) |</w:t>
+      </w:r>
+    </w:p>
+    <w:p>
+      <w:r>
+        <w:rPr>
+          <w:rFonts w:ascii="Courier New" w:cs="Courier New" w:eastAsia="Courier New" w:hAnsi="Courier New"/>
+          <w:sz w:val="20"/>
+          <w:szCs w:val="20"/>
+        </w:rPr>
+        <w:t xml:space="preserve">           |    new nucleus  |  |   new nucleus  |</w:t>
+      </w:r>
+    </w:p>
+    <w:p>
+      <w:r>
+        <w:rPr>
+          <w:rFonts w:ascii="Courier New" w:cs="Courier New" w:eastAsia="Courier New" w:hAnsi="Courier New"/>
+          <w:sz w:val="20"/>
+          <w:szCs w:val="20"/>
+        </w:rPr>
+        <w:t xml:space="preserve">           |      forms      |  |      forms     |</w:t>
+      </w:r>
+    </w:p>
+    <w:p>
+      <w:r>
+        <w:rPr>
+          <w:rFonts w:ascii="Courier New" w:cs="Courier New" w:eastAsia="Courier New" w:hAnsi="Courier New"/>
+          <w:sz w:val="20"/>
+          <w:szCs w:val="20"/>
+        </w:rPr>
+        <w:t xml:space="preserve">            \_______   ______/    \______   _____/</w:t>
+      </w:r>
+    </w:p>
+    <w:p>
+      <w:r>
+        <w:rPr>
+          <w:rFonts w:ascii="Courier New" w:cs="Courier New" w:eastAsia="Courier New" w:hAnsi="Courier New"/>
+          <w:sz w:val="20"/>
+          <w:szCs w:val="20"/>
+        </w:rPr>
+        <w:t xml:space="preserve">                    \ /                  \ /</w:t>
+      </w:r>
+    </w:p>
+    <w:p>
+      <w:r>
+        <w:rPr>
+          <w:rFonts w:ascii="Courier New" w:cs="Courier New" w:eastAsia="Courier New" w:hAnsi="Courier New"/>
+          <w:sz w:val="20"/>
+          <w:szCs w:val="20"/>
+        </w:rPr>
+        <w:t xml:space="preserve">                  cleavage furrow / cytokinesis</w:t>
       </w:r>
     </w:p>
     <w:p>
@@ -683,112 +861,132 @@
           <w:sz w:val="24"/>
           <w:szCs w:val="24"/>
         </w:rPr>
-        <w:t xml:space="preserve">Prophase I</w:t>
-      </w:r>
-    </w:p>
-    <w:p>
-      <w:r>
-        <w:t xml:space="preserve"/>
-      </w:r>
-    </w:p>
-    <w:p>
-      <w:r>
-        <w:rPr>
-          <w:rFonts w:ascii="Courier New" w:cs="Courier New" w:eastAsia="Courier New" w:hAnsi="Courier New"/>
-          <w:sz w:val="20"/>
-          <w:szCs w:val="20"/>
-        </w:rPr>
-        <w:t xml:space="preserve">   ________________________________</w:t>
-      </w:r>
-    </w:p>
-    <w:p>
-      <w:r>
-        <w:rPr>
-          <w:rFonts w:ascii="Courier New" w:cs="Courier New" w:eastAsia="Courier New" w:hAnsi="Courier New"/>
-          <w:sz w:val="20"/>
-          <w:szCs w:val="20"/>
-        </w:rPr>
-        <w:t xml:space="preserve">  /                                \</w:t>
-      </w:r>
-    </w:p>
-    <w:p>
-      <w:r>
-        <w:rPr>
-          <w:rFonts w:ascii="Courier New" w:cs="Courier New" w:eastAsia="Courier New" w:hAnsi="Courier New"/>
-          <w:sz w:val="20"/>
-          <w:szCs w:val="20"/>
-        </w:rPr>
-        <w:t xml:space="preserve"> | Homologous pair 1: X(A) next to X(a) |</w:t>
-      </w:r>
-    </w:p>
-    <w:p>
-      <w:r>
-        <w:rPr>
-          <w:rFonts w:ascii="Courier New" w:cs="Courier New" w:eastAsia="Courier New" w:hAnsi="Courier New"/>
-          <w:sz w:val="20"/>
-          <w:szCs w:val="20"/>
-        </w:rPr>
-        <w:t xml:space="preserve"> | Homologous pair 2: X(B) next to X(b) |</w:t>
-      </w:r>
-    </w:p>
-    <w:p>
-      <w:r>
-        <w:rPr>
-          <w:rFonts w:ascii="Courier New" w:cs="Courier New" w:eastAsia="Courier New" w:hAnsi="Courier New"/>
-          <w:sz w:val="20"/>
-          <w:szCs w:val="20"/>
-        </w:rPr>
-        <w:t xml:space="preserve"> |  (synapsis/tetrads form)             |</w:t>
-      </w:r>
-    </w:p>
-    <w:p>
-      <w:r>
-        <w:rPr>
-          <w:rFonts w:ascii="Courier New" w:cs="Courier New" w:eastAsia="Courier New" w:hAnsi="Courier New"/>
-          <w:sz w:val="20"/>
-          <w:szCs w:val="20"/>
-        </w:rPr>
-        <w:t xml:space="preserve"> |  crossing over between non-sister    |</w:t>
-      </w:r>
-    </w:p>
-    <w:p>
-      <w:r>
-        <w:rPr>
-          <w:rFonts w:ascii="Courier New" w:cs="Courier New" w:eastAsia="Courier New" w:hAnsi="Courier New"/>
-          <w:sz w:val="20"/>
-          <w:szCs w:val="20"/>
-        </w:rPr>
-        <w:t xml:space="preserve"> |  chromatids occurs at chiasmata       |</w:t>
-      </w:r>
-    </w:p>
-    <w:p>
-      <w:r>
-        <w:rPr>
-          <w:rFonts w:ascii="Courier New" w:cs="Courier New" w:eastAsia="Courier New" w:hAnsi="Courier New"/>
-          <w:sz w:val="20"/>
-          <w:szCs w:val="20"/>
-        </w:rPr>
-        <w:t xml:space="preserve"> |  centrosomes + centrioles move poles  |</w:t>
-      </w:r>
-    </w:p>
-    <w:p>
-      <w:r>
-        <w:rPr>
-          <w:rFonts w:ascii="Courier New" w:cs="Courier New" w:eastAsia="Courier New" w:hAnsi="Courier New"/>
-          <w:sz w:val="20"/>
-          <w:szCs w:val="20"/>
-        </w:rPr>
-        <w:t xml:space="preserve"> |  nuclear membrane breaks down         |</w:t>
-      </w:r>
-    </w:p>
-    <w:p>
-      <w:r>
-        <w:rPr>
-          <w:rFonts w:ascii="Courier New" w:cs="Courier New" w:eastAsia="Courier New" w:hAnsi="Courier New"/>
-          <w:sz w:val="20"/>
-          <w:szCs w:val="20"/>
-        </w:rPr>
-        <w:t xml:space="preserve">  \____________________________________/</w:t>
+        <w:t xml:space="preserve">Prophase I (synapsis + crossing over)</w:t>
+      </w:r>
+    </w:p>
+    <w:p>
+      <w:r>
+        <w:t xml:space="preserve"/>
+      </w:r>
+    </w:p>
+    <w:p>
+      <w:r>
+        <w:rPr>
+          <w:rFonts w:ascii="Courier New" w:cs="Courier New" w:eastAsia="Courier New" w:hAnsi="Courier New"/>
+          <w:sz w:val="20"/>
+          <w:szCs w:val="20"/>
+        </w:rPr>
+        <w:t xml:space="preserve">           _______________________________________</w:t>
+      </w:r>
+    </w:p>
+    <w:p>
+      <w:r>
+        <w:rPr>
+          <w:rFonts w:ascii="Courier New" w:cs="Courier New" w:eastAsia="Courier New" w:hAnsi="Courier New"/>
+          <w:sz w:val="20"/>
+          <w:szCs w:val="20"/>
+        </w:rPr>
+        <w:t xml:space="preserve">         /                                         \</w:t>
+      </w:r>
+    </w:p>
+    <w:p>
+      <w:r>
+        <w:rPr>
+          <w:rFonts w:ascii="Courier New" w:cs="Courier New" w:eastAsia="Courier New" w:hAnsi="Courier New"/>
+          <w:sz w:val="20"/>
+          <w:szCs w:val="20"/>
+        </w:rPr>
+        <w:t xml:space="preserve">        /                                           \</w:t>
+      </w:r>
+    </w:p>
+    <w:p>
+      <w:r>
+        <w:rPr>
+          <w:rFonts w:ascii="Courier New" w:cs="Courier New" w:eastAsia="Courier New" w:hAnsi="Courier New"/>
+          <w:sz w:val="20"/>
+          <w:szCs w:val="20"/>
+        </w:rPr>
+        <w:t xml:space="preserve">       |     *                               *       |</w:t>
+      </w:r>
+    </w:p>
+    <w:p>
+      <w:r>
+        <w:rPr>
+          <w:rFonts w:ascii="Courier New" w:cs="Courier New" w:eastAsia="Courier New" w:hAnsi="Courier New"/>
+          <w:sz w:val="20"/>
+          <w:szCs w:val="20"/>
+        </w:rPr>
+        <w:t xml:space="preserve">       |      \                             /        |</w:t>
+      </w:r>
+    </w:p>
+    <w:p>
+      <w:r>
+        <w:rPr>
+          <w:rFonts w:ascii="Courier New" w:cs="Courier New" w:eastAsia="Courier New" w:hAnsi="Courier New"/>
+          <w:sz w:val="20"/>
+          <w:szCs w:val="20"/>
+        </w:rPr>
+        <w:t xml:space="preserve">       |       (  X(A) == X(a)  )   &lt;- homologous pair</w:t>
+      </w:r>
+    </w:p>
+    <w:p>
+      <w:r>
+        <w:rPr>
+          <w:rFonts w:ascii="Courier New" w:cs="Courier New" w:eastAsia="Courier New" w:hAnsi="Courier New"/>
+          <w:sz w:val="20"/>
+          <w:szCs w:val="20"/>
+        </w:rPr>
+        <w:t xml:space="preserve">       |       (   X(B) == X(b) )   &lt;- homologous pair</w:t>
+      </w:r>
+    </w:p>
+    <w:p>
+      <w:r>
+        <w:rPr>
+          <w:rFonts w:ascii="Courier New" w:cs="Courier New" w:eastAsia="Courier New" w:hAnsi="Courier New"/>
+          <w:sz w:val="20"/>
+          <w:szCs w:val="20"/>
+        </w:rPr>
+        <w:t xml:space="preserve">       |            x        x       &lt;- chiasmata</w:t>
+      </w:r>
+    </w:p>
+    <w:p>
+      <w:r>
+        <w:rPr>
+          <w:rFonts w:ascii="Courier New" w:cs="Courier New" w:eastAsia="Courier New" w:hAnsi="Courier New"/>
+          <w:sz w:val="20"/>
+          <w:szCs w:val="20"/>
+        </w:rPr>
+        <w:t xml:space="preserve">       |      crossing over between non-sister       |</w:t>
+      </w:r>
+    </w:p>
+    <w:p>
+      <w:r>
+        <w:rPr>
+          <w:rFonts w:ascii="Courier New" w:cs="Courier New" w:eastAsia="Courier New" w:hAnsi="Courier New"/>
+          <w:sz w:val="20"/>
+          <w:szCs w:val="20"/>
+        </w:rPr>
+        <w:t xml:space="preserve">       |      chromatids (gene segments swap)        |</w:t>
+      </w:r>
+    </w:p>
+    <w:p>
+      <w:r>
+        <w:rPr>
+          <w:rFonts w:ascii="Courier New" w:cs="Courier New" w:eastAsia="Courier New" w:hAnsi="Courier New"/>
+          <w:sz w:val="20"/>
+          <w:szCs w:val="20"/>
+        </w:rPr>
+        <w:t xml:space="preserve">        \                                           /</w:t>
+      </w:r>
+    </w:p>
+    <w:p>
+      <w:r>
+        <w:rPr>
+          <w:rFonts w:ascii="Courier New" w:cs="Courier New" w:eastAsia="Courier New" w:hAnsi="Courier New"/>
+          <w:sz w:val="20"/>
+          <w:szCs w:val="20"/>
+        </w:rPr>
+        <w:t xml:space="preserve">         \_________________________________________/</w:t>
       </w:r>
     </w:p>
     <w:p>
@@ -865,57 +1063,97 @@
           <w:sz w:val="20"/>
           <w:szCs w:val="20"/>
         </w:rPr>
-        <w:t xml:space="preserve">   __________________________</w:t>
-      </w:r>
-    </w:p>
-    <w:p>
-      <w:r>
-        <w:rPr>
-          <w:rFonts w:ascii="Courier New" w:cs="Courier New" w:eastAsia="Courier New" w:hAnsi="Courier New"/>
-          <w:sz w:val="20"/>
-          <w:szCs w:val="20"/>
-        </w:rPr>
-        <w:t xml:space="preserve">  /                          \</w:t>
-      </w:r>
-    </w:p>
-    <w:p>
-      <w:r>
-        <w:rPr>
-          <w:rFonts w:ascii="Courier New" w:cs="Courier New" w:eastAsia="Courier New" w:hAnsi="Courier New"/>
-          <w:sz w:val="20"/>
-          <w:szCs w:val="20"/>
-        </w:rPr>
-        <w:t xml:space="preserve"> | [SF]--&gt; X(A)X(a)          |</w:t>
-      </w:r>
-    </w:p>
-    <w:p>
-      <w:r>
-        <w:rPr>
-          <w:rFonts w:ascii="Courier New" w:cs="Courier New" w:eastAsia="Courier New" w:hAnsi="Courier New"/>
-          <w:sz w:val="20"/>
-          <w:szCs w:val="20"/>
-        </w:rPr>
-        <w:t xml:space="preserve"> | [SF]--&gt; X(B)X(b)  |equator|</w:t>
-      </w:r>
-    </w:p>
-    <w:p>
-      <w:r>
-        <w:rPr>
-          <w:rFonts w:ascii="Courier New" w:cs="Courier New" w:eastAsia="Courier New" w:hAnsi="Courier New"/>
-          <w:sz w:val="20"/>
-          <w:szCs w:val="20"/>
-        </w:rPr>
-        <w:t xml:space="preserve"> | (homologous pairs align)  |</w:t>
-      </w:r>
-    </w:p>
-    <w:p>
-      <w:r>
-        <w:rPr>
-          <w:rFonts w:ascii="Courier New" w:cs="Courier New" w:eastAsia="Courier New" w:hAnsi="Courier New"/>
-          <w:sz w:val="20"/>
-          <w:szCs w:val="20"/>
-        </w:rPr>
-        <w:t xml:space="preserve">  \__________________________/</w:t>
+        <w:t xml:space="preserve">           _______________________________________</w:t>
+      </w:r>
+    </w:p>
+    <w:p>
+      <w:r>
+        <w:rPr>
+          <w:rFonts w:ascii="Courier New" w:cs="Courier New" w:eastAsia="Courier New" w:hAnsi="Courier New"/>
+          <w:sz w:val="20"/>
+          <w:szCs w:val="20"/>
+        </w:rPr>
+        <w:t xml:space="preserve">         /                                         \</w:t>
+      </w:r>
+    </w:p>
+    <w:p>
+      <w:r>
+        <w:rPr>
+          <w:rFonts w:ascii="Courier New" w:cs="Courier New" w:eastAsia="Courier New" w:hAnsi="Courier New"/>
+          <w:sz w:val="20"/>
+          <w:szCs w:val="20"/>
+        </w:rPr>
+        <w:t xml:space="preserve">        /                                           \</w:t>
+      </w:r>
+    </w:p>
+    <w:p>
+      <w:r>
+        <w:rPr>
+          <w:rFonts w:ascii="Courier New" w:cs="Courier New" w:eastAsia="Courier New" w:hAnsi="Courier New"/>
+          <w:sz w:val="20"/>
+          <w:szCs w:val="20"/>
+        </w:rPr>
+        <w:t xml:space="preserve">       |   *-----------------------------------*    |</w:t>
+      </w:r>
+    </w:p>
+    <w:p>
+      <w:r>
+        <w:rPr>
+          <w:rFonts w:ascii="Courier New" w:cs="Courier New" w:eastAsia="Courier New" w:hAnsi="Courier New"/>
+          <w:sz w:val="20"/>
+          <w:szCs w:val="20"/>
+        </w:rPr>
+        <w:t xml:space="preserve">       |        X(A)X(a)      X(B)X(b)              |</w:t>
+      </w:r>
+    </w:p>
+    <w:p>
+      <w:r>
+        <w:rPr>
+          <w:rFonts w:ascii="Courier New" w:cs="Courier New" w:eastAsia="Courier New" w:hAnsi="Courier New"/>
+          <w:sz w:val="20"/>
+          <w:szCs w:val="20"/>
+        </w:rPr>
+        <w:t xml:space="preserve">       |          tetrad         tetrad             |</w:t>
+      </w:r>
+    </w:p>
+    <w:p>
+      <w:r>
+        <w:rPr>
+          <w:rFonts w:ascii="Courier New" w:cs="Courier New" w:eastAsia="Courier New" w:hAnsi="Courier New"/>
+          <w:sz w:val="20"/>
+          <w:szCs w:val="20"/>
+        </w:rPr>
+        <w:t xml:space="preserve">       |            |      equator      |           |</w:t>
+      </w:r>
+    </w:p>
+    <w:p>
+      <w:r>
+        <w:rPr>
+          <w:rFonts w:ascii="Courier New" w:cs="Courier New" w:eastAsia="Courier New" w:hAnsi="Courier New"/>
+          <w:sz w:val="20"/>
+          <w:szCs w:val="20"/>
+        </w:rPr>
+        <w:t xml:space="preserve">       |   homologous chromosomes aligned as pairs  |</w:t>
+      </w:r>
+    </w:p>
+    <w:p>
+      <w:r>
+        <w:rPr>
+          <w:rFonts w:ascii="Courier New" w:cs="Courier New" w:eastAsia="Courier New" w:hAnsi="Courier New"/>
+          <w:sz w:val="20"/>
+          <w:szCs w:val="20"/>
+        </w:rPr>
+        <w:t xml:space="preserve">        \                                           /</w:t>
+      </w:r>
+    </w:p>
+    <w:p>
+      <w:r>
+        <w:rPr>
+          <w:rFonts w:ascii="Courier New" w:cs="Courier New" w:eastAsia="Courier New" w:hAnsi="Courier New"/>
+          <w:sz w:val="20"/>
+          <w:szCs w:val="20"/>
+        </w:rPr>
+        <w:t xml:space="preserve">         \_________________________________________/</w:t>
       </w:r>
     </w:p>
     <w:p>
@@ -951,67 +1189,97 @@
           <w:sz w:val="20"/>
           <w:szCs w:val="20"/>
         </w:rPr>
-        <w:t xml:space="preserve">   __________________________</w:t>
-      </w:r>
-    </w:p>
-    <w:p>
-      <w:r>
-        <w:rPr>
-          <w:rFonts w:ascii="Courier New" w:cs="Courier New" w:eastAsia="Courier New" w:hAnsi="Courier New"/>
-          <w:sz w:val="20"/>
-          <w:szCs w:val="20"/>
-        </w:rPr>
-        <w:t xml:space="preserve">  /                          \</w:t>
-      </w:r>
-    </w:p>
-    <w:p>
-      <w:r>
-        <w:rPr>
-          <w:rFonts w:ascii="Courier New" w:cs="Courier New" w:eastAsia="Courier New" w:hAnsi="Courier New"/>
-          <w:sz w:val="20"/>
-          <w:szCs w:val="20"/>
-        </w:rPr>
-        <w:t xml:space="preserve"> |  X(A)  X(B)   -&gt;          |</w:t>
-      </w:r>
-    </w:p>
-    <w:p>
-      <w:r>
-        <w:rPr>
-          <w:rFonts w:ascii="Courier New" w:cs="Courier New" w:eastAsia="Courier New" w:hAnsi="Courier New"/>
-          <w:sz w:val="20"/>
-          <w:szCs w:val="20"/>
-        </w:rPr>
-        <w:t xml:space="preserve"> |          &lt;-   X(a)  X(b)  |</w:t>
-      </w:r>
-    </w:p>
-    <w:p>
-      <w:r>
-        <w:rPr>
-          <w:rFonts w:ascii="Courier New" w:cs="Courier New" w:eastAsia="Courier New" w:hAnsi="Courier New"/>
-          <w:sz w:val="20"/>
-          <w:szCs w:val="20"/>
-        </w:rPr>
-        <w:t xml:space="preserve"> | (homologs separate;        |</w:t>
-      </w:r>
-    </w:p>
-    <w:p>
-      <w:r>
-        <w:rPr>
-          <w:rFonts w:ascii="Courier New" w:cs="Courier New" w:eastAsia="Courier New" w:hAnsi="Courier New"/>
-          <w:sz w:val="20"/>
-          <w:szCs w:val="20"/>
-        </w:rPr>
-        <w:t xml:space="preserve"> |  sister chromatids stay)   |</w:t>
-      </w:r>
-    </w:p>
-    <w:p>
-      <w:r>
-        <w:rPr>
-          <w:rFonts w:ascii="Courier New" w:cs="Courier New" w:eastAsia="Courier New" w:hAnsi="Courier New"/>
-          <w:sz w:val="20"/>
-          <w:szCs w:val="20"/>
-        </w:rPr>
-        <w:t xml:space="preserve">  \__________________________/</w:t>
+        <w:t xml:space="preserve">           _______________________________________</w:t>
+      </w:r>
+    </w:p>
+    <w:p>
+      <w:r>
+        <w:rPr>
+          <w:rFonts w:ascii="Courier New" w:cs="Courier New" w:eastAsia="Courier New" w:hAnsi="Courier New"/>
+          <w:sz w:val="20"/>
+          <w:szCs w:val="20"/>
+        </w:rPr>
+        <w:t xml:space="preserve">         /                                         \</w:t>
+      </w:r>
+    </w:p>
+    <w:p>
+      <w:r>
+        <w:rPr>
+          <w:rFonts w:ascii="Courier New" w:cs="Courier New" w:eastAsia="Courier New" w:hAnsi="Courier New"/>
+          <w:sz w:val="20"/>
+          <w:szCs w:val="20"/>
+        </w:rPr>
+        <w:t xml:space="preserve">        /                                           \</w:t>
+      </w:r>
+    </w:p>
+    <w:p>
+      <w:r>
+        <w:rPr>
+          <w:rFonts w:ascii="Courier New" w:cs="Courier New" w:eastAsia="Courier New" w:hAnsi="Courier New"/>
+          <w:sz w:val="20"/>
+          <w:szCs w:val="20"/>
+        </w:rPr>
+        <w:t xml:space="preserve">       |      *                             *       |</w:t>
+      </w:r>
+    </w:p>
+    <w:p>
+      <w:r>
+        <w:rPr>
+          <w:rFonts w:ascii="Courier New" w:cs="Courier New" w:eastAsia="Courier New" w:hAnsi="Courier New"/>
+          <w:sz w:val="20"/>
+          <w:szCs w:val="20"/>
+        </w:rPr>
+        <w:t xml:space="preserve">       |     / \                           / \      |</w:t>
+      </w:r>
+    </w:p>
+    <w:p>
+      <w:r>
+        <w:rPr>
+          <w:rFonts w:ascii="Courier New" w:cs="Courier New" w:eastAsia="Courier New" w:hAnsi="Courier New"/>
+          <w:sz w:val="20"/>
+          <w:szCs w:val="20"/>
+        </w:rPr>
+        <w:t xml:space="preserve">       |   X(A)  X(B)               X(a)   X(b)    |</w:t>
+      </w:r>
+    </w:p>
+    <w:p>
+      <w:r>
+        <w:rPr>
+          <w:rFonts w:ascii="Courier New" w:cs="Courier New" w:eastAsia="Courier New" w:hAnsi="Courier New"/>
+          <w:sz w:val="20"/>
+          <w:szCs w:val="20"/>
+        </w:rPr>
+        <w:t xml:space="preserve">       |   (to left pole)          (to right pole) |</w:t>
+      </w:r>
+    </w:p>
+    <w:p>
+      <w:r>
+        <w:rPr>
+          <w:rFonts w:ascii="Courier New" w:cs="Courier New" w:eastAsia="Courier New" w:hAnsi="Courier New"/>
+          <w:sz w:val="20"/>
+          <w:szCs w:val="20"/>
+        </w:rPr>
+        <w:t xml:space="preserve">       |   homologs separate; sister chromatids stay|</w:t>
+      </w:r>
+    </w:p>
+    <w:p>
+      <w:r>
+        <w:rPr>
+          <w:rFonts w:ascii="Courier New" w:cs="Courier New" w:eastAsia="Courier New" w:hAnsi="Courier New"/>
+          <w:sz w:val="20"/>
+          <w:szCs w:val="20"/>
+        </w:rPr>
+        <w:t xml:space="preserve">        \                                           /</w:t>
+      </w:r>
+    </w:p>
+    <w:p>
+      <w:r>
+        <w:rPr>
+          <w:rFonts w:ascii="Courier New" w:cs="Courier New" w:eastAsia="Courier New" w:hAnsi="Courier New"/>
+          <w:sz w:val="20"/>
+          <w:szCs w:val="20"/>
+        </w:rPr>
+        <w:t xml:space="preserve">         \_________________________________________/</w:t>
       </w:r>
     </w:p>
     <w:p>
@@ -1047,47 +1315,67 @@
           <w:sz w:val="20"/>
           <w:szCs w:val="20"/>
         </w:rPr>
-        <w:t xml:space="preserve">  ________________      ________________</w:t>
-      </w:r>
-    </w:p>
-    <w:p>
-      <w:r>
-        <w:rPr>
-          <w:rFonts w:ascii="Courier New" w:cs="Courier New" w:eastAsia="Courier New" w:hAnsi="Courier New"/>
-          <w:sz w:val="20"/>
-          <w:szCs w:val="20"/>
-        </w:rPr>
-        <w:t xml:space="preserve"> /                \    /                \</w:t>
-      </w:r>
-    </w:p>
-    <w:p>
-      <w:r>
-        <w:rPr>
-          <w:rFonts w:ascii="Courier New" w:cs="Courier New" w:eastAsia="Courier New" w:hAnsi="Courier New"/>
-          <w:sz w:val="20"/>
-          <w:szCs w:val="20"/>
-        </w:rPr>
-        <w:t xml:space="preserve">|   X(A)   X(B)    |  |   X(a)   X(b)    |</w:t>
-      </w:r>
-    </w:p>
-    <w:p>
-      <w:r>
-        <w:rPr>
-          <w:rFonts w:ascii="Courier New" w:cs="Courier New" w:eastAsia="Courier New" w:hAnsi="Courier New"/>
-          <w:sz w:val="20"/>
-          <w:szCs w:val="20"/>
-        </w:rPr>
-        <w:t xml:space="preserve">|   (n = 2)        |  |   (n = 2)        |</w:t>
-      </w:r>
-    </w:p>
-    <w:p>
-      <w:r>
-        <w:rPr>
-          <w:rFonts w:ascii="Courier New" w:cs="Courier New" w:eastAsia="Courier New" w:hAnsi="Courier New"/>
-          <w:sz w:val="20"/>
-          <w:szCs w:val="20"/>
-        </w:rPr>
-        <w:t xml:space="preserve"> \________________/    \________________/</w:t>
+        <w:t xml:space="preserve">             __________________    __________________</w:t>
+      </w:r>
+    </w:p>
+    <w:p>
+      <w:r>
+        <w:rPr>
+          <w:rFonts w:ascii="Courier New" w:cs="Courier New" w:eastAsia="Courier New" w:hAnsi="Courier New"/>
+          <w:sz w:val="20"/>
+          <w:szCs w:val="20"/>
+        </w:rPr>
+        <w:t xml:space="preserve">            /                  \  /                  \</w:t>
+      </w:r>
+    </w:p>
+    <w:p>
+      <w:r>
+        <w:rPr>
+          <w:rFonts w:ascii="Courier New" w:cs="Courier New" w:eastAsia="Courier New" w:hAnsi="Courier New"/>
+          <w:sz w:val="20"/>
+          <w:szCs w:val="20"/>
+        </w:rPr>
+        <w:t xml:space="preserve">           |   X(A)    X(B)     ||   X(a)    X(b)    |</w:t>
+      </w:r>
+    </w:p>
+    <w:p>
+      <w:r>
+        <w:rPr>
+          <w:rFonts w:ascii="Courier New" w:cs="Courier New" w:eastAsia="Courier New" w:hAnsi="Courier New"/>
+          <w:sz w:val="20"/>
+          <w:szCs w:val="20"/>
+        </w:rPr>
+        <w:t xml:space="preserve">           |      haploid (n=2) ||     haploid (n=2) |</w:t>
+      </w:r>
+    </w:p>
+    <w:p>
+      <w:r>
+        <w:rPr>
+          <w:rFonts w:ascii="Courier New" w:cs="Courier New" w:eastAsia="Courier New" w:hAnsi="Courier New"/>
+          <w:sz w:val="20"/>
+          <w:szCs w:val="20"/>
+        </w:rPr>
+        <w:t xml:space="preserve">            \__________  _______/ \_______  _________/</w:t>
+      </w:r>
+    </w:p>
+    <w:p>
+      <w:r>
+        <w:rPr>
+          <w:rFonts w:ascii="Courier New" w:cs="Courier New" w:eastAsia="Courier New" w:hAnsi="Courier New"/>
+          <w:sz w:val="20"/>
+          <w:szCs w:val="20"/>
+        </w:rPr>
+        <w:t xml:space="preserve">                       \/                 \/</w:t>
+      </w:r>
+    </w:p>
+    <w:p>
+      <w:r>
+        <w:rPr>
+          <w:rFonts w:ascii="Courier New" w:cs="Courier New" w:eastAsia="Courier New" w:hAnsi="Courier New"/>
+          <w:sz w:val="20"/>
+          <w:szCs w:val="20"/>
+        </w:rPr>
+        <w:t xml:space="preserve">                    cytokinesis forms 2 cells</w:t>
       </w:r>
     </w:p>
     <w:p>
@@ -1123,47 +1411,67 @@
           <w:sz w:val="20"/>
           <w:szCs w:val="20"/>
         </w:rPr>
-        <w:t xml:space="preserve">  ________________      ________________</w:t>
-      </w:r>
-    </w:p>
-    <w:p>
-      <w:r>
-        <w:rPr>
-          <w:rFonts w:ascii="Courier New" w:cs="Courier New" w:eastAsia="Courier New" w:hAnsi="Courier New"/>
-          <w:sz w:val="20"/>
-          <w:szCs w:val="20"/>
-        </w:rPr>
-        <w:t xml:space="preserve"> /                \    /                \</w:t>
-      </w:r>
-    </w:p>
-    <w:p>
-      <w:r>
-        <w:rPr>
-          <w:rFonts w:ascii="Courier New" w:cs="Courier New" w:eastAsia="Courier New" w:hAnsi="Courier New"/>
-          <w:sz w:val="20"/>
-          <w:szCs w:val="20"/>
-        </w:rPr>
-        <w:t xml:space="preserve">| X(A)   X(B)      |  | X(a)   X(b)      |</w:t>
-      </w:r>
-    </w:p>
-    <w:p>
-      <w:r>
-        <w:rPr>
-          <w:rFonts w:ascii="Courier New" w:cs="Courier New" w:eastAsia="Courier New" w:hAnsi="Courier New"/>
-          <w:sz w:val="20"/>
-          <w:szCs w:val="20"/>
-        </w:rPr>
-        <w:t xml:space="preserve">| new spindles form|  | new spindles form|</w:t>
-      </w:r>
-    </w:p>
-    <w:p>
-      <w:r>
-        <w:rPr>
-          <w:rFonts w:ascii="Courier New" w:cs="Courier New" w:eastAsia="Courier New" w:hAnsi="Courier New"/>
-          <w:sz w:val="20"/>
-          <w:szCs w:val="20"/>
-        </w:rPr>
-        <w:t xml:space="preserve"> \________________/    \________________/</w:t>
+        <w:t xml:space="preserve">          ________________            ________________</w:t>
+      </w:r>
+    </w:p>
+    <w:p>
+      <w:r>
+        <w:rPr>
+          <w:rFonts w:ascii="Courier New" w:cs="Courier New" w:eastAsia="Courier New" w:hAnsi="Courier New"/>
+          <w:sz w:val="20"/>
+          <w:szCs w:val="20"/>
+        </w:rPr>
+        <w:t xml:space="preserve">         /                \          /                \</w:t>
+      </w:r>
+    </w:p>
+    <w:p>
+      <w:r>
+        <w:rPr>
+          <w:rFonts w:ascii="Courier New" w:cs="Courier New" w:eastAsia="Courier New" w:hAnsi="Courier New"/>
+          <w:sz w:val="20"/>
+          <w:szCs w:val="20"/>
+        </w:rPr>
+        <w:t xml:space="preserve">        |  *        *      |        |   *       *     |</w:t>
+      </w:r>
+    </w:p>
+    <w:p>
+      <w:r>
+        <w:rPr>
+          <w:rFonts w:ascii="Courier New" w:cs="Courier New" w:eastAsia="Courier New" w:hAnsi="Courier New"/>
+          <w:sz w:val="20"/>
+          <w:szCs w:val="20"/>
+        </w:rPr>
+        <w:t xml:space="preserve">        |   \      /       |        |    \     /      |</w:t>
+      </w:r>
+    </w:p>
+    <w:p>
+      <w:r>
+        <w:rPr>
+          <w:rFonts w:ascii="Courier New" w:cs="Courier New" w:eastAsia="Courier New" w:hAnsi="Courier New"/>
+          <w:sz w:val="20"/>
+          <w:szCs w:val="20"/>
+        </w:rPr>
+        <w:t xml:space="preserve">        |    X(A) X(B)     |        |    X(a) X(b)    |</w:t>
+      </w:r>
+    </w:p>
+    <w:p>
+      <w:r>
+        <w:rPr>
+          <w:rFonts w:ascii="Courier New" w:cs="Courier New" w:eastAsia="Courier New" w:hAnsi="Courier New"/>
+          <w:sz w:val="20"/>
+          <w:szCs w:val="20"/>
+        </w:rPr>
+        <w:t xml:space="preserve">        | new spindle forms|        | new spindle forms|</w:t>
+      </w:r>
+    </w:p>
+    <w:p>
+      <w:r>
+        <w:rPr>
+          <w:rFonts w:ascii="Courier New" w:cs="Courier New" w:eastAsia="Courier New" w:hAnsi="Courier New"/>
+          <w:sz w:val="20"/>
+          <w:szCs w:val="20"/>
+        </w:rPr>
+        <w:t xml:space="preserve">         \________________/          \________________/</w:t>
       </w:r>
     </w:p>
     <w:p>
@@ -1199,57 +1507,67 @@
           <w:sz w:val="20"/>
           <w:szCs w:val="20"/>
         </w:rPr>
-        <w:t xml:space="preserve">  ________________      ________________</w:t>
-      </w:r>
-    </w:p>
-    <w:p>
-      <w:r>
-        <w:rPr>
-          <w:rFonts w:ascii="Courier New" w:cs="Courier New" w:eastAsia="Courier New" w:hAnsi="Courier New"/>
-          <w:sz w:val="20"/>
-          <w:szCs w:val="20"/>
-        </w:rPr>
-        <w:t xml:space="preserve"> /                \    /                \</w:t>
-      </w:r>
-    </w:p>
-    <w:p>
-      <w:r>
-        <w:rPr>
-          <w:rFonts w:ascii="Courier New" w:cs="Courier New" w:eastAsia="Courier New" w:hAnsi="Courier New"/>
-          <w:sz w:val="20"/>
-          <w:szCs w:val="20"/>
-        </w:rPr>
-        <w:t xml:space="preserve">| [SF]--&gt; X(A)     |  | [SF]--&gt; X(a)     |</w:t>
-      </w:r>
-    </w:p>
-    <w:p>
-      <w:r>
-        <w:rPr>
-          <w:rFonts w:ascii="Courier New" w:cs="Courier New" w:eastAsia="Courier New" w:hAnsi="Courier New"/>
-          <w:sz w:val="20"/>
-          <w:szCs w:val="20"/>
-        </w:rPr>
-        <w:t xml:space="preserve">| [SF]--&gt; X(B)     |  | [SF]--&gt; X(b)     |</w:t>
-      </w:r>
-    </w:p>
-    <w:p>
-      <w:r>
-        <w:rPr>
-          <w:rFonts w:ascii="Courier New" w:cs="Courier New" w:eastAsia="Courier New" w:hAnsi="Courier New"/>
-          <w:sz w:val="20"/>
-          <w:szCs w:val="20"/>
-        </w:rPr>
-        <w:t xml:space="preserve">|      |equator|   |  |      |equator|   |</w:t>
-      </w:r>
-    </w:p>
-    <w:p>
-      <w:r>
-        <w:rPr>
-          <w:rFonts w:ascii="Courier New" w:cs="Courier New" w:eastAsia="Courier New" w:hAnsi="Courier New"/>
-          <w:sz w:val="20"/>
-          <w:szCs w:val="20"/>
-        </w:rPr>
-        <w:t xml:space="preserve"> \________________/    \________________/</w:t>
+        <w:t xml:space="preserve">          ________________            ________________</w:t>
+      </w:r>
+    </w:p>
+    <w:p>
+      <w:r>
+        <w:rPr>
+          <w:rFonts w:ascii="Courier New" w:cs="Courier New" w:eastAsia="Courier New" w:hAnsi="Courier New"/>
+          <w:sz w:val="20"/>
+          <w:szCs w:val="20"/>
+        </w:rPr>
+        <w:t xml:space="preserve">         /                \          /                \</w:t>
+      </w:r>
+    </w:p>
+    <w:p>
+      <w:r>
+        <w:rPr>
+          <w:rFonts w:ascii="Courier New" w:cs="Courier New" w:eastAsia="Courier New" w:hAnsi="Courier New"/>
+          <w:sz w:val="20"/>
+          <w:szCs w:val="20"/>
+        </w:rPr>
+        <w:t xml:space="preserve">        | *----------*     |        | *----------*    |</w:t>
+      </w:r>
+    </w:p>
+    <w:p>
+      <w:r>
+        <w:rPr>
+          <w:rFonts w:ascii="Courier New" w:cs="Courier New" w:eastAsia="Courier New" w:hAnsi="Courier New"/>
+          <w:sz w:val="20"/>
+          <w:szCs w:val="20"/>
+        </w:rPr>
+        <w:t xml:space="preserve">        |     X(A)         |        |      X(a)       |</w:t>
+      </w:r>
+    </w:p>
+    <w:p>
+      <w:r>
+        <w:rPr>
+          <w:rFonts w:ascii="Courier New" w:cs="Courier New" w:eastAsia="Courier New" w:hAnsi="Courier New"/>
+          <w:sz w:val="20"/>
+          <w:szCs w:val="20"/>
+        </w:rPr>
+        <w:t xml:space="preserve">        |     X(B)         |        |      X(b)       |</w:t>
+      </w:r>
+    </w:p>
+    <w:p>
+      <w:r>
+        <w:rPr>
+          <w:rFonts w:ascii="Courier New" w:cs="Courier New" w:eastAsia="Courier New" w:hAnsi="Courier New"/>
+          <w:sz w:val="20"/>
+          <w:szCs w:val="20"/>
+        </w:rPr>
+        <w:t xml:space="preserve">        |   | equator |    |        |    | equator |  |</w:t>
+      </w:r>
+    </w:p>
+    <w:p>
+      <w:r>
+        <w:rPr>
+          <w:rFonts w:ascii="Courier New" w:cs="Courier New" w:eastAsia="Courier New" w:hAnsi="Courier New"/>
+          <w:sz w:val="20"/>
+          <w:szCs w:val="20"/>
+        </w:rPr>
+        <w:t xml:space="preserve">         \________________/          \________________/</w:t>
       </w:r>
     </w:p>
     <w:p>
@@ -1285,57 +1603,67 @@
           <w:sz w:val="20"/>
           <w:szCs w:val="20"/>
         </w:rPr>
-        <w:t xml:space="preserve">  ________________      ________________</w:t>
-      </w:r>
-    </w:p>
-    <w:p>
-      <w:r>
-        <w:rPr>
-          <w:rFonts w:ascii="Courier New" w:cs="Courier New" w:eastAsia="Courier New" w:hAnsi="Courier New"/>
-          <w:sz w:val="20"/>
-          <w:szCs w:val="20"/>
-        </w:rPr>
-        <w:t xml:space="preserve"> /                \    /                \</w:t>
-      </w:r>
-    </w:p>
-    <w:p>
-      <w:r>
-        <w:rPr>
-          <w:rFonts w:ascii="Courier New" w:cs="Courier New" w:eastAsia="Courier New" w:hAnsi="Courier New"/>
-          <w:sz w:val="20"/>
-          <w:szCs w:val="20"/>
-        </w:rPr>
-        <w:t xml:space="preserve">| A|   B|   &lt;- -&gt; |  | a|   b|   &lt;- -&gt; |</w:t>
-      </w:r>
-    </w:p>
-    <w:p>
-      <w:r>
-        <w:rPr>
-          <w:rFonts w:ascii="Courier New" w:cs="Courier New" w:eastAsia="Courier New" w:hAnsi="Courier New"/>
-          <w:sz w:val="20"/>
-          <w:szCs w:val="20"/>
-        </w:rPr>
-        <w:t xml:space="preserve">| |A   |B         |  | |a   |b         |</w:t>
-      </w:r>
-    </w:p>
-    <w:p>
-      <w:r>
-        <w:rPr>
-          <w:rFonts w:ascii="Courier New" w:cs="Courier New" w:eastAsia="Courier New" w:hAnsi="Courier New"/>
-          <w:sz w:val="20"/>
-          <w:szCs w:val="20"/>
-        </w:rPr>
-        <w:t xml:space="preserve">| (sister chromatids separate in each cell) |</w:t>
-      </w:r>
-    </w:p>
-    <w:p>
-      <w:r>
-        <w:rPr>
-          <w:rFonts w:ascii="Courier New" w:cs="Courier New" w:eastAsia="Courier New" w:hAnsi="Courier New"/>
-          <w:sz w:val="20"/>
-          <w:szCs w:val="20"/>
-        </w:rPr>
-        <w:t xml:space="preserve"> \________________/    \________________/</w:t>
+        <w:t xml:space="preserve">          ________________            ________________</w:t>
+      </w:r>
+    </w:p>
+    <w:p>
+      <w:r>
+        <w:rPr>
+          <w:rFonts w:ascii="Courier New" w:cs="Courier New" w:eastAsia="Courier New" w:hAnsi="Courier New"/>
+          <w:sz w:val="20"/>
+          <w:szCs w:val="20"/>
+        </w:rPr>
+        <w:t xml:space="preserve">         /                \          /                \</w:t>
+      </w:r>
+    </w:p>
+    <w:p>
+      <w:r>
+        <w:rPr>
+          <w:rFonts w:ascii="Courier New" w:cs="Courier New" w:eastAsia="Courier New" w:hAnsi="Courier New"/>
+          <w:sz w:val="20"/>
+          <w:szCs w:val="20"/>
+        </w:rPr>
+        <w:t xml:space="preserve">        | *          *     |        | *          *    |</w:t>
+      </w:r>
+    </w:p>
+    <w:p>
+      <w:r>
+        <w:rPr>
+          <w:rFonts w:ascii="Courier New" w:cs="Courier New" w:eastAsia="Courier New" w:hAnsi="Courier New"/>
+          <w:sz w:val="20"/>
+          <w:szCs w:val="20"/>
+        </w:rPr>
+        <w:t xml:space="preserve">        | A|      |A       |        | a|      |a      |</w:t>
+      </w:r>
+    </w:p>
+    <w:p>
+      <w:r>
+        <w:rPr>
+          <w:rFonts w:ascii="Courier New" w:cs="Courier New" w:eastAsia="Courier New" w:hAnsi="Courier New"/>
+          <w:sz w:val="20"/>
+          <w:szCs w:val="20"/>
+        </w:rPr>
+        <w:t xml:space="preserve">        | B|      |B       |        | b|      |b      |</w:t>
+      </w:r>
+    </w:p>
+    <w:p>
+      <w:r>
+        <w:rPr>
+          <w:rFonts w:ascii="Courier New" w:cs="Courier New" w:eastAsia="Courier New" w:hAnsi="Courier New"/>
+          <w:sz w:val="20"/>
+          <w:szCs w:val="20"/>
+        </w:rPr>
+        <w:t xml:space="preserve">        | chromatids separate in each cell             |</w:t>
+      </w:r>
+    </w:p>
+    <w:p>
+      <w:r>
+        <w:rPr>
+          <w:rFonts w:ascii="Courier New" w:cs="Courier New" w:eastAsia="Courier New" w:hAnsi="Courier New"/>
+          <w:sz w:val="20"/>
+          <w:szCs w:val="20"/>
+        </w:rPr>
+        <w:t xml:space="preserve">         \________________/          \________________/</w:t>
       </w:r>
     </w:p>
     <w:p>
@@ -1371,47 +1699,47 @@
           <w:sz w:val="20"/>
           <w:szCs w:val="20"/>
         </w:rPr>
-        <w:t xml:space="preserve">   _________   _________   _________   _________</w:t>
-      </w:r>
-    </w:p>
-    <w:p>
-      <w:r>
-        <w:rPr>
-          <w:rFonts w:ascii="Courier New" w:cs="Courier New" w:eastAsia="Courier New" w:hAnsi="Courier New"/>
-          <w:sz w:val="20"/>
-          <w:szCs w:val="20"/>
-        </w:rPr>
-        <w:t xml:space="preserve">  /         \ /         \ /         \ /         \</w:t>
-      </w:r>
-    </w:p>
-    <w:p>
-      <w:r>
-        <w:rPr>
-          <w:rFonts w:ascii="Courier New" w:cs="Courier New" w:eastAsia="Courier New" w:hAnsi="Courier New"/>
-          <w:sz w:val="20"/>
-          <w:szCs w:val="20"/>
-        </w:rPr>
-        <w:t xml:space="preserve"> |  A   B    | a   b    | A-a  B    | a-A  b    |</w:t>
-      </w:r>
-    </w:p>
-    <w:p>
-      <w:r>
-        <w:rPr>
-          <w:rFonts w:ascii="Courier New" w:cs="Courier New" w:eastAsia="Courier New" w:hAnsi="Courier New"/>
-          <w:sz w:val="20"/>
-          <w:szCs w:val="20"/>
-        </w:rPr>
-        <w:t xml:space="preserve"> | (n=2)     | (n=2)    | (n=2)     | (n=2)     |</w:t>
-      </w:r>
-    </w:p>
-    <w:p>
-      <w:r>
-        <w:rPr>
-          <w:rFonts w:ascii="Courier New" w:cs="Courier New" w:eastAsia="Courier New" w:hAnsi="Courier New"/>
-          <w:sz w:val="20"/>
-          <w:szCs w:val="20"/>
-        </w:rPr>
-        <w:t xml:space="preserve">  \_________/ \_________/ \_________/ \_________/</w:t>
+        <w:t xml:space="preserve">        __________   __________   __________   __________</w:t>
+      </w:r>
+    </w:p>
+    <w:p>
+      <w:r>
+        <w:rPr>
+          <w:rFonts w:ascii="Courier New" w:cs="Courier New" w:eastAsia="Courier New" w:hAnsi="Courier New"/>
+          <w:sz w:val="20"/>
+          <w:szCs w:val="20"/>
+        </w:rPr>
+        <w:t xml:space="preserve">       /          \ /          \ /          \ /          \</w:t>
+      </w:r>
+    </w:p>
+    <w:p>
+      <w:r>
+        <w:rPr>
+          <w:rFonts w:ascii="Courier New" w:cs="Courier New" w:eastAsia="Courier New" w:hAnsi="Courier New"/>
+          <w:sz w:val="20"/>
+          <w:szCs w:val="20"/>
+        </w:rPr>
+        <w:t xml:space="preserve">      |  A   B     |  a   b     |  A-a  B    |  a-A  b   |</w:t>
+      </w:r>
+    </w:p>
+    <w:p>
+      <w:r>
+        <w:rPr>
+          <w:rFonts w:ascii="Courier New" w:cs="Courier New" w:eastAsia="Courier New" w:hAnsi="Courier New"/>
+          <w:sz w:val="20"/>
+          <w:szCs w:val="20"/>
+        </w:rPr>
+        <w:t xml:space="preserve">      |   n = 2    |   n = 2    |   n = 2    |   n = 2   |</w:t>
+      </w:r>
+    </w:p>
+    <w:p>
+      <w:r>
+        <w:rPr>
+          <w:rFonts w:ascii="Courier New" w:cs="Courier New" w:eastAsia="Courier New" w:hAnsi="Courier New"/>
+          <w:sz w:val="20"/>
+          <w:szCs w:val="20"/>
+        </w:rPr>
+        <w:t xml:space="preserve">       \__________/ \__________/ \__________/ \__________/</w:t>
       </w:r>
     </w:p>
     <w:p>

</xml_diff>